<commit_message>
Add Karakter-kamp teaching materials + integrate into week
- Laerervejledning_Karakter-kamp (md+docx): rules, differentiation,
  Fælles Mål, a 5-lesson week plan, discussion questions
- Elevark_Karakter-kamp (md+docx): rules + worksheets (timeline log,
  guess-the-person, design-your-own-card, reflection)
- Ugeplan: weave the game across the week; add materials to the index
- index.html + README: link the new teacher guide and student sheet

Co-Authored-By: Claude Opus 4.8 (1M context) <noreply@anthropic.com>
</commit_message>
<xml_diff>
--- a/Ugeplan_uge25.docx
+++ b/Ugeplan_uge25.docx
@@ -438,8 +438,10 @@
         <w:t>eksamensnerver-snak</w:t>
       </w:r>
       <w:r>
-        <w:t xml:space="preserve"> (~20 min, se nedenfor), derefter </w:t>
+        <w:t xml:space="preserve"> (~20 min, se nedenfor), derefter</w:t>
       </w:r>
+    </w:p>
+    <w:p>
       <w:r>
         <w:rPr>
           <w:b/>
@@ -574,10 +576,38 @@
         <w:rPr>
           <w:b/>
         </w:rPr>
-        <w:t>karakter-kortspillet</w:t>
+        <w:t>Karakter-kamp</w:t>
       </w:r>
       <w:r>
-        <w:t xml:space="preserve"> (religion/historie, kobler til tirsdagens tema), Jeopardy eller brætspil. Lavt pres — ingen film nødvendig.</w:t>
+        <w:t xml:space="preserve"> — spil </w:t>
+      </w:r>
+      <w:r>
+        <w:rPr>
+          <w:b/>
+        </w:rPr>
+        <w:t>Trumf-dyst</w:t>
+      </w:r>
+      <w:r>
+        <w:t xml:space="preserve"> eller </w:t>
+      </w:r>
+      <w:r>
+        <w:rPr>
+          <w:b/>
+        </w:rPr>
+        <w:t>Tidslinje</w:t>
+      </w:r>
+      <w:r>
+        <w:t xml:space="preserve"> (kobler til tirsdagens religionstema), Jeopardy eller brætspil. Lavt pres — ingen film nødvendig. Se </w:t>
+      </w:r>
+      <w:r>
+        <w:rPr>
+          <w:rFonts w:ascii="Consolas" w:hAnsi="Consolas"/>
+          <w:color w:val="B03060"/>
+        </w:rPr>
+        <w:t>Laerervejledning_Karakter-kamp</w:t>
+      </w:r>
+      <w:r>
+        <w:t>.</w:t>
       </w:r>
     </w:p>
     <w:p>
@@ -688,6 +718,68 @@
         <w:rPr>
           <w:b/>
         </w:rPr>
+        <w:t>Karakter-kamp (kort/smartboard):</w:t>
+      </w:r>
+      <w:r>
+        <w:t xml:space="preserve"> 52-kort Top Trumps om religiøse og historiske personer — spil </w:t>
+      </w:r>
+      <w:r>
+        <w:rPr>
+          <w:b/>
+        </w:rPr>
+        <w:t>Trumf-dyst</w:t>
+      </w:r>
+      <w:r>
+        <w:t xml:space="preserve"> (dyst kort mod kort på point) eller </w:t>
+      </w:r>
+      <w:r>
+        <w:rPr>
+          <w:b/>
+        </w:rPr>
+        <w:t>Tidslinje</w:t>
+      </w:r>
+      <w:r>
+        <w:t xml:space="preserve"> (placér personer kronologisk). Kan printes som rigtige spillekort. Åbn </w:t>
+      </w:r>
+      <w:r>
+        <w:rPr>
+          <w:rFonts w:ascii="Consolas" w:hAnsi="Consolas"/>
+          <w:color w:val="B03060"/>
+        </w:rPr>
+        <w:t>Kortspil_religion-historie.html</w:t>
+      </w:r>
+      <w:r>
+        <w:t xml:space="preserve">; se </w:t>
+      </w:r>
+      <w:r>
+        <w:rPr>
+          <w:rFonts w:ascii="Consolas" w:hAnsi="Consolas"/>
+          <w:color w:val="B03060"/>
+        </w:rPr>
+        <w:t>Laerervejledning_Karakter-kamp</w:t>
+      </w:r>
+      <w:r>
+        <w:t xml:space="preserve"> + </w:t>
+      </w:r>
+      <w:r>
+        <w:rPr>
+          <w:rFonts w:ascii="Consolas" w:hAnsi="Consolas"/>
+          <w:color w:val="B03060"/>
+        </w:rPr>
+        <w:t>Elevark_Karakter-kamp</w:t>
+      </w:r>
+      <w:r>
+        <w:t>.</w:t>
+      </w:r>
+    </w:p>
+    <w:p>
+      <w:pPr>
+        <w:pStyle w:val="ListBullet"/>
+      </w:pPr>
+      <w:r>
+        <w:rPr>
+          <w:b/>
+        </w:rPr>
         <w:t>Jeopardy (smartboard):</w:t>
       </w:r>
       <w:r>
@@ -696,6 +788,7 @@
       <w:r>
         <w:rPr>
           <w:rFonts w:ascii="Consolas" w:hAnsi="Consolas"/>
+          <w:color w:val="B03060"/>
         </w:rPr>
         <w:t>Jeopardy_uge25.html</w:t>
       </w:r>
@@ -903,19 +996,10 @@
         <w:rPr>
           <w:b/>
         </w:rPr>
-        <w:t>Karakter-kortspil (religion/historie):</w:t>
+        <w:t>Design dit eget karakter-kort:</w:t>
       </w:r>
       <w:r>
-        <w:t xml:space="preserve"> 100 kort til tidslinje, "gæt personen" eller sortér religiøs/historisk. Åbn </w:t>
-      </w:r>
-      <w:r>
-        <w:rPr>
-          <w:rFonts w:ascii="Consolas" w:hAnsi="Consolas"/>
-        </w:rPr>
-        <w:t>Kortspil_religion-historie.html</w:t>
-      </w:r>
-      <w:r>
-        <w:t>.</w:t>
+        <w:t xml:space="preserve"> eleverne researcher en person, der mangler i Karakter-kamp-dækket, og laver et nyt kort med begrundede point (skabelon i elevarket). Stærk faglig opgave — kan fremlægges.</w:t>
       </w:r>
     </w:p>
     <w:p>
@@ -932,9 +1016,9 @@
       </w:r>
     </w:p>
     <w:p>
-      <w:pPr>
-        <w:pStyle w:val="ListNumber"/>
-      </w:pPr>
+      <w:r>
+        <w:t xml:space="preserve">1. </w:t>
+      </w:r>
       <w:r>
         <w:rPr>
           <w:b/>
@@ -942,13 +1026,8 @@
         <w:t>Normaliser (5 min):</w:t>
       </w:r>
       <w:r>
-        <w:t xml:space="preserve"> Nervøsitet er helt normalt — det er kroppens måde at gøre dig skarp på (kamp/flugt). Det betyder, at du er klar, ikke at noget er galt.</w:t>
+        <w:t xml:space="preserve"> Nervøsitet er helt normalt — det er kroppens måde at gøre dig skarp på (kamp/flugt). Det betyder, at du er klar, ikke at noget er galt. 2. </w:t>
       </w:r>
-    </w:p>
-    <w:p>
-      <w:pPr>
-        <w:pStyle w:val="ListNumber"/>
-      </w:pPr>
       <w:r>
         <w:rPr>
           <w:b/>
@@ -965,13 +1044,8 @@
         <w:t>vejrtrækningsøvelse</w:t>
       </w:r>
       <w:r>
-        <w:t xml:space="preserve"> sammen (fx boks-vejrtrækning: ind 4 – hold 4 – ud 4 – hold 4). Tal kort om søvn, mad og bevægelse op til eksamen.</w:t>
+        <w:t xml:space="preserve"> sammen (fx boks-vejrtrækning: ind 4 – hold 4 – ud 4 – hold 4). Tal kort om søvn, mad og bevægelse op til eksamen. 3. </w:t>
       </w:r>
-    </w:p>
-    <w:p>
-      <w:pPr>
-        <w:pStyle w:val="ListNumber"/>
-      </w:pPr>
       <w:r>
         <w:rPr>
           <w:b/>
@@ -979,13 +1053,8 @@
         <w:t>Hovedet (5 min):</w:t>
       </w:r>
       <w:r>
-        <w:t xml:space="preserve"> Katastrofetanker ("jeg dumper") vs. realistiske tanker ("jeg har forberedt mig, og 'godt nok' er godt nok"). Forberedelse = tryghed.</w:t>
+        <w:t xml:space="preserve"> Katastrofetanker ("jeg dumper") vs. realistiske tanker ("jeg har forberedt mig, og 'godt nok' er godt nok"). Forberedelse = tryghed. 4. </w:t>
       </w:r>
-    </w:p>
-    <w:p>
-      <w:pPr>
-        <w:pStyle w:val="ListNumber"/>
-      </w:pPr>
       <w:r>
         <w:rPr>
           <w:b/>
@@ -993,13 +1062,8 @@
         <w:t>Praktisk (5 min):</w:t>
       </w:r>
       <w:r>
-        <w:t xml:space="preserve"> Kom i god tid, hav vand med, læs ikke i sidste sekund, hold små pauser, planlæg dagen.</w:t>
+        <w:t xml:space="preserve"> Kom i god tid, hav vand med, læs ikke i sidste sekund, hold små pauser, planlæg dagen. 5. </w:t>
       </w:r>
-    </w:p>
-    <w:p>
-      <w:pPr>
-        <w:pStyle w:val="ListNumber"/>
-      </w:pPr>
       <w:r>
         <w:rPr>
           <w:b/>
@@ -1162,7 +1226,7 @@
         <w:pStyle w:val="ListBullet"/>
       </w:pPr>
       <w:r>
-        <w:t>☐ Print til religionsforløbet (spørgsmålskort, A3-papir, tuscher, post-its)</w:t>
+        <w:t>[ ] Print til religionsforløbet (spørgsmålskort, A3-papir, tuscher, post-its)</w:t>
       </w:r>
     </w:p>
     <w:p>
@@ -1170,7 +1234,7 @@
         <w:pStyle w:val="ListBullet"/>
       </w:pPr>
       <w:r>
-        <w:t>☐ Vælg evt. et kort filmklip/podcast om død &amp; håb til religion (valgfrit)</w:t>
+        <w:t>[ ] Vælg evt. et kort filmklip/podcast om død &amp; håb til religion (valgfrit)</w:t>
       </w:r>
     </w:p>
     <w:p>
@@ -1178,7 +1242,7 @@
         <w:pStyle w:val="ListBullet"/>
       </w:pPr>
       <w:r>
-        <w:t>☐ Klargør Kahoot/escape room til matematik</w:t>
+        <w:t>[ ] Klargør Kahoot/escape room til matematik</w:t>
       </w:r>
     </w:p>
     <w:p>
@@ -1186,7 +1250,7 @@
         <w:pStyle w:val="ListBullet"/>
       </w:pPr>
       <w:r>
-        <w:t>☐ Find en film + opgaveark til historie</w:t>
+        <w:t>[ ] Find en film + opgaveark til historie</w:t>
       </w:r>
     </w:p>
     <w:p>
@@ -1194,7 +1258,7 @@
         <w:pStyle w:val="ListBullet"/>
       </w:pPr>
       <w:r>
-        <w:t>☐ Hav en vejrtrækningsøvelse klar til eksamensnerver-modulet</w:t>
+        <w:t>[ ] Hav en vejrtrækningsøvelse klar til eksamensnerver-modulet</w:t>
       </w:r>
     </w:p>
     <w:p>
@@ -1263,7 +1327,44 @@
         <w:t>Kortspil_religion-historie.html</w:t>
       </w:r>
       <w:r>
-        <w:t xml:space="preserve"> — 100 karakter-kort (religiøse + historiske personer); bagsiden lærer hvornår/hvem/hvad/konsekvens. Til quiz, tidslinje, "gæt personen".</w:t>
+        <w:t xml:space="preserve"> — 100 karakter-kort + </w:t>
+      </w:r>
+      <w:r>
+        <w:rPr>
+          <w:b/>
+        </w:rPr>
+        <w:t>Karakter-kamp</w:t>
+      </w:r>
+      <w:r>
+        <w:t>-spillet: Trumf-dyst (Top Trumps) og Tidslinje med et 52-korts spildæk (point pr. person). Kan printes som spillekort. Bagsiden lærer hvornår/hvem/hvad/konsekvens.</w:t>
+      </w:r>
+    </w:p>
+    <w:p>
+      <w:pPr>
+        <w:pStyle w:val="ListBullet"/>
+      </w:pPr>
+      <w:r>
+        <w:rPr>
+          <w:b/>
+        </w:rPr>
+        <w:t>Laerervejledning_Karakter-kamp</w:t>
+      </w:r>
+      <w:r>
+        <w:t xml:space="preserve"> (Word) — fuld lærervejledning: regler, differentiering, Fælles Mål, et ugeforløb og diskussionsspørgsmål.</w:t>
+      </w:r>
+    </w:p>
+    <w:p>
+      <w:pPr>
+        <w:pStyle w:val="ListBullet"/>
+      </w:pPr>
+      <w:r>
+        <w:rPr>
+          <w:b/>
+        </w:rPr>
+        <w:t>Elevark_Karakter-kamp</w:t>
+      </w:r>
+      <w:r>
+        <w:t xml:space="preserve"> (Word) — spilleregler + arbejdsark (tidslinje-log, gæt personen, design dit eget kort, refleksion).</w:t>
       </w:r>
     </w:p>
     <w:p>
@@ -1277,15 +1378,7 @@
         <w:t>Rollespil_historie_stoettedokument</w:t>
       </w:r>
       <w:r>
-        <w:t xml:space="preserve"> (Word) — scenariebaseret rollespil om</w:t>
-      </w:r>
-    </w:p>
-    <w:p>
-      <w:pPr>
-        <w:pStyle w:val="ListNumber"/>
-      </w:pPr>
-      <w:r>
-        <w:t>verdenskrig, som eleverne selv sætter op.</w:t>
+        <w:t xml:space="preserve"> (Word) — scenariebaseret rollespil om 2. verdenskrig, som eleverne selv sætter op.</w:t>
       </w:r>
     </w:p>
     <w:p>
@@ -1313,8 +1406,10 @@
         <w:t>Escape-room_matematik_LAERER</w:t>
       </w:r>
       <w:r>
-        <w:t xml:space="preserve"> (Word) — lærervejledning med facit </w:t>
+        <w:t xml:space="preserve"> (Word) — lærervejledning med facit</w:t>
       </w:r>
+    </w:p>
+    <w:p>
       <w:r>
         <w:rPr>
           <w:i/>
@@ -1333,10 +1428,23 @@
         <w:t>Forslag til brug:</w:t>
       </w:r>
       <w:r>
-        <w:t xml:space="preserve"> Jeopardy og karakter-kortspillet som "alternativer til film" ons/tors; escape room til 8B onsdag/torsdag; rollespillet i en historielektion.</w:t>
+        <w:t xml:space="preserve"> Jeopardy og </w:t>
+      </w:r>
+      <w:r>
+        <w:rPr>
+          <w:b/>
+        </w:rPr>
+        <w:t>Karakter-kamp</w:t>
+      </w:r>
+      <w:r>
+        <w:t xml:space="preserve"> som "alternativer til film" ons/tors (Karakter-kamp kan fylde flere lektioner — se ugeforløbet i lærervejledningen); escape room til 8B onsdag/torsdag; rollespillet i en historielektion.</w:t>
       </w:r>
     </w:p>
-    <w:p/>
+    <w:p>
+      <w:pPr>
+        <w:spacing w:before="40" w:after="120"/>
+      </w:pPr>
+    </w:p>
     <w:p>
       <w:r>
         <w:rPr>
@@ -1718,6 +1826,10 @@
     <w:name w:val="Normal"/>
     <w:qFormat/>
     <w:rsid w:val="00FC693F"/>
+    <w:rPr>
+      <w:rFonts w:ascii="Calibri" w:hAnsi="Calibri"/>
+      <w:sz w:val="22"/>
+    </w:rPr>
   </w:style>
   <w:style w:type="paragraph" w:styleId="Header">
     <w:name w:val="header"/>

</xml_diff>